<commit_message>
APA 7: centered headings, page numbers, italic in-text title
Co-authored-by: Notab123 <aliyaakhmetova12@gmail.com>
</commit_message>
<xml_diff>
--- a/kazakh-b1/Kanapiyauly_Yernur_SE-2509_Assignment1.docx
+++ b/kazakh-b1/Kanapiyauly_Yernur_SE-2509_Assignment1.docx
@@ -22,11 +22,14 @@
       </w:r>
     </w:p>
     <w:p>
+      <w:pPr>
+        <w:jc w:val="center"/>
+      </w:pPr>
       <w:r>
         <w:rPr>
           <w:b/>
         </w:rPr>
-        <w:t>1. Материалды қалай жинадым</w:t>
+        <w:t>Материалды қалай жинадым</w:t>
       </w:r>
     </w:p>
     <w:p>
@@ -74,11 +77,14 @@
       </w:r>
     </w:p>
     <w:p>
+      <w:pPr>
+        <w:jc w:val="center"/>
+      </w:pPr>
       <w:r>
         <w:rPr>
           <w:b/>
         </w:rPr>
-        <w:t>2. Үш дереккөзді салыстыру</w:t>
+        <w:t>Үш дереккөзді салыстыру</w:t>
       </w:r>
     </w:p>
     <w:p>
@@ -89,7 +95,16 @@
         <w:rPr>
           <w:b w:val="0"/>
         </w:rPr>
-        <w:t>Мен El.kz мақаласын (Асылбекова, 2026), ESET мақаласын (ESET, 2025) және BAQ.KZ жаңалығын («Алаяқтар жасанды интеллект арқылы», 2026) салыстырдым.</w:t>
+        <w:t>Мен El.kz мақаласын (Асылбекова, 2026), ESET мақаласын (ESET, 2025) және BAQ.KZ жаңалығын (</w:t>
+      </w:r>
+      <w:r>
+        <w:rPr>
+          <w:i/>
+        </w:rPr>
+        <w:t>Алаяқтар жасанды интеллект арқылы алдауға көшті</w:t>
+      </w:r>
+      <w:r>
+        <w:t>, 2026) салыстырдым.</w:t>
       </w:r>
     </w:p>
     <w:p>
@@ -126,11 +141,14 @@
       </w:r>
     </w:p>
     <w:p>
+      <w:pPr>
+        <w:jc w:val="center"/>
+      </w:pPr>
       <w:r>
         <w:rPr>
           <w:b/>
         </w:rPr>
-        <w:t>3. Дереккөздерге шолу және менің пікірім</w:t>
+        <w:t>Дереккөздерге шолу және менің пікірім</w:t>
       </w:r>
     </w:p>
     <w:p>
@@ -336,6 +354,7 @@
       </w:r>
     </w:p>
     <w:sectPr>
+      <w:headerReference w:type="default" r:id="rId9"/>
       <w:pgSz w:w="12240" w:h="15840"/>
       <w:pgMar w:top="1440" w:right="1440" w:bottom="1440" w:left="1440" w:header="720" w:footer="720" w:gutter="0"/>
       <w:cols w:space="720"/>
@@ -343,6 +362,22 @@
     </w:sectPr>
   </w:body>
 </w:document>
+</file>
+
+<file path=word/header1.xml><?xml version="1.0" encoding="utf-8"?>
+<w:hdr xmlns:m="http://schemas.openxmlformats.org/officeDocument/2006/math" xmlns:mc="http://schemas.openxmlformats.org/markup-compatibility/2006" xmlns:mo="http://schemas.microsoft.com/office/mac/office/2008/main" xmlns:mv="urn:schemas-microsoft-com:mac:vml" xmlns:o="urn:schemas-microsoft-com:office:office" xmlns:r="http://schemas.openxmlformats.org/officeDocument/2006/relationships" xmlns:v="urn:schemas-microsoft-com:vml" xmlns:w10="urn:schemas-microsoft-com:office:word" xmlns:w14="http://schemas.microsoft.com/office/word/2010/wordml" xmlns:w="http://schemas.openxmlformats.org/wordprocessingml/2006/main" xmlns:wne="http://schemas.microsoft.com/office/word/2006/wordml" xmlns:wp14="http://schemas.microsoft.com/office/word/2010/wordprocessingDrawing" xmlns:wp="http://schemas.openxmlformats.org/drawingml/2006/wordprocessingDrawing" xmlns:wpc="http://schemas.microsoft.com/office/word/2010/wordprocessingCanvas" xmlns:wpg="http://schemas.microsoft.com/office/word/2010/wordprocessingGroup" xmlns:wpi="http://schemas.microsoft.com/office/word/2010/wordprocessingInk" xmlns:wps="http://schemas.microsoft.com/office/word/2010/wordprocessingShape" mc:Ignorable="w14 wp14">
+  <w:p>
+    <w:pPr>
+      <w:pStyle w:val="Header"/>
+      <w:jc w:val="right"/>
+    </w:pPr>
+    <w:r>
+      <w:fldChar w:fldCharType="begin"/>
+      <w:instrText xml:space="preserve">PAGE</w:instrText>
+      <w:fldChar w:fldCharType="end"/>
+    </w:r>
+  </w:p>
+</w:hdr>
 </file>
 
 <file path=word/numbering.xml><?xml version="1.0" encoding="utf-8"?>

</xml_diff>

<commit_message>
Replace long dashes with hyphens
Co-authored-by: Notab123 <aliyaakhmetova12@gmail.com>
</commit_message>
<xml_diff>
--- a/kazakh-b1/Kanapiyauly_Yernur_SE-2509_Assignment1.docx
+++ b/kazakh-b1/Kanapiyauly_Yernur_SE-2509_Assignment1.docx
@@ -51,7 +51,7 @@
         <w:rPr>
           <w:b w:val="0"/>
         </w:rPr>
-        <w:t>Материалды негізінен интернеттен іздедім. Google жүйесіне «жасанды интеллект киберқауіпсіздік», «ЖИ алаяқтық» деген сөздерді қазақша жаздым. Ғылыми мақалаларды CyberLeninka сайтынан және университет журналдарының сайттарынан таптым. Жаңалықтарды El.kz және BAQ.KZ сайттарынан алдым. Тағы бір дереккөз – ESET антивирус компаниясының сайты.</w:t>
+        <w:t>Материалды негізінен интернеттен іздедім. Google жүйесіне «жасанды интеллект киберқауіпсіздік», «ЖИ алаяқтық» деген сөздерді қазақша жаздым. Ғылыми мақалаларды CyberLeninka сайтынан және университет журналдарының сайттарынан таптым. Жаңалықтарды El.kz және BAQ.KZ сайттарынан алдым. Тағы бір дереккөз - ESET антивирус компаниясының сайты.</w:t>
       </w:r>
     </w:p>
     <w:p>
@@ -62,7 +62,7 @@
         <w:rPr>
           <w:b w:val="0"/>
         </w:rPr>
-        <w:t>Дереккөздерді таңдағанда мына критерийлерге сүйендім: мәтін қазақ тілінде болуы керек; ақпарат жаңа болуы керек (2022–2026 жылдар); авторы немесе ұйымы белгілі болуы керек; сайт сенімді болуы керек.</w:t>
+        <w:t>Дереккөздерді таңдағанда мына критерийлерге сүйендім: мәтін қазақ тілінде болуы керек; ақпарат жаңа болуы керек (2022-2026 жылдар); авторы немесе ұйымы белгілі болуы керек; сайт сенімді болуы керек.</w:t>
       </w:r>
     </w:p>
     <w:p>
@@ -73,7 +73,7 @@
         <w:rPr>
           <w:b w:val="0"/>
         </w:rPr>
-        <w:t>Бірінші қиындық – бұл тақырып бойынша материалдардың көбі орыс немесе ағылшын тілінде. Кейбір мақалалардың тақырыбы қазақша, бірақ толық мәтіні орысша болып шықты. Сондықтан оларды тізімге қоспадым. Екінші қиындық – ғылыми мақалаларда техникалық терминдер көп. Түсінбеген сөздерді сөздіктен қарадым. Әлеуметтік желілердегі жазбаларды алмадым, себебі олардың авторы белгісіз және ақпараты тексерілмеген.</w:t>
+        <w:t>Бірінші қиындық - бұл тақырып бойынша материалдардың көбі орыс немесе ағылшын тілінде. Кейбір мақалалардың тақырыбы қазақша, бірақ толық мәтіні орысша болып шықты. Сондықтан оларды тізімге қоспадым. Екінші қиындық - ғылыми мақалаларда техникалық терминдер көп. Түсінбеген сөздерді сөздіктен қарадым. Әлеуметтік желілердегі жазбаларды алмадым, себебі олардың авторы белгісіз және ақпараты тексерілмеген.</w:t>
       </w:r>
     </w:p>
     <w:p>
@@ -126,7 +126,7 @@
         <w:rPr>
           <w:b w:val="0"/>
         </w:rPr>
-        <w:t>Айырмашылығы. El.kz мақаласы ЖИ-ді пайдалы құрал ретінде көрсетеді. Автордың ойынша, ең басты қауіп – адамның өзі: әлсіз құпиясөз, бір құпиясөзді бірнеше жерде қолдану. ESET – антивирус компаниясы. Оның мақаласында ЖИ-дің екі жағы да бар: мамандар оны қорғау үшін, ал қылмыскерлер шабуыл үшін қолданады. Бұл мақала көбірек болашақтағы қауіптер туралы. BAQ.KZ мақаласы – жаңалық, ол Ішкі істер министрлігінің ескертуіне негізделген. Мұнда Қазақстандағы нақты жағдай айтылады: алаяқтар полиция немесе банк қызметкері болып бейнеқоңырау шалады.</w:t>
+        <w:t>Айырмашылығы. El.kz мақаласы ЖИ-ді пайдалы құрал ретінде көрсетеді. Автордың ойынша, ең басты қауіп - адамның өзі: әлсіз құпиясөз, бір құпиясөзді бірнеше жерде қолдану. ESET - антивирус компаниясы. Оның мақаласында ЖИ-дің екі жағы да бар: мамандар оны қорғау үшін, ал қылмыскерлер шабуыл үшін қолданады. Бұл мақала көбірек болашақтағы қауіптер туралы. BAQ.KZ мақаласы - жаңалық, ол Ішкі істер министрлігінің ескертуіне негізделген. Мұнда Қазақстандағы нақты жағдай айтылады: алаяқтар полиция немесе банк қызметкері болып бейнеқоңырау шалады.</w:t>
       </w:r>
     </w:p>
     <w:p>
@@ -170,7 +170,7 @@
         <w:rPr>
           <w:b w:val="0"/>
         </w:rPr>
-        <w:t>Меніңше, ЖИ өзі жақсы да, жаман да емес. Бұл – құрал. Оны кім және қалай қолданатыны маңызды. «Машиналар соғысы» деген ой мұны жақсы көрсетеді.</w:t>
+        <w:t>Меніңше, ЖИ өзі жақсы да, жаман да емес. Бұл - құрал. Оны кім және қалай қолданатыны маңызды. «Машиналар соғысы» деген ой мұны жақсы көрсетеді.</w:t>
       </w:r>
     </w:p>
     <w:p>
@@ -181,7 +181,7 @@
         <w:rPr>
           <w:b w:val="0"/>
         </w:rPr>
-        <w:t>Мен El.kz авторымен келісемін: ең әлсіз буын – адам. Ең жақсы бағдарлама да адамның қатесінен қорғай алмайды. Мысалы, адам SMS-кодты алаяққа өзі айтып қойса, ешбір жүйе көмектеспейді.</w:t>
+        <w:t>Мен El.kz авторымен келісемін: ең әлсіз буын - адам. Ең жақсы бағдарлама да адамның қатесінен қорғай алмайды. Мысалы, адам SMS-кодты алаяққа өзі айтып қойса, ешбір жүйе көмектеспейді.</w:t>
       </w:r>
     </w:p>
     <w:p>
@@ -203,7 +203,7 @@
         <w:rPr>
           <w:b w:val="0"/>
         </w:rPr>
-        <w:t>Тағы бір мәселе – егде адамдар. Жастар жаңа технологияны жақсы біледі, ал ата-әжелеріміз жалған дауысты ажырата алмауы мүмкін. Сондықтан отбасында цифрлық сауаттылық туралы сөйлесу керек. Мысалы, отбасында тек өзімізге белгілі «құпия сөз» ойлап табуға болады.</w:t>
+        <w:t>Тағы бір мәселе - егде адамдар. Жастар жаңа технологияны жақсы біледі, ал ата-әжелеріміз жалған дауысты ажырата алмауы мүмкін. Сондықтан отбасында цифрлық сауаттылық туралы сөйлесу керек. Мысалы, отбасында тек өзімізге белгілі «құпия сөз» ойлап табуға болады.</w:t>
       </w:r>
     </w:p>
     <w:p>
@@ -225,7 +225,7 @@
         <w:rPr>
           <w:b w:val="0"/>
         </w:rPr>
-        <w:t>Қорытындылай келе, ЖИ – әрі қорғаушы, әрі қауіп. Меніңше, қорғанудың ең жақсы жолы – сақ болу, сыни ойлау және ақпаратты тексеру.</w:t>
+        <w:t>Қорытындылай келе, ЖИ - әрі қорғаушы, әрі қауіп. Меніңше, қорғанудың ең жақсы жолы - сақ болу, сыни ойлау және ақпаратты тексеру.</w:t>
       </w:r>
     </w:p>
     <w:p>
@@ -304,7 +304,7 @@
         <w:rPr>
           <w:i w:val="0"/>
         </w:rPr>
-        <w:t>(1), 41–50. https://doi.org/10.32523/2616-6844-2026-154-1-41-50</w:t>
+        <w:t>(1), 41-50. https://doi.org/10.32523/2616-6844-2026-154-1-41-50</w:t>
       </w:r>
     </w:p>
     <w:p>
@@ -327,7 +327,7 @@
         <w:rPr>
           <w:i w:val="0"/>
         </w:rPr>
-        <w:t>(2), 161–168. https://doi.org/10.56525/QSRQ6093</w:t>
+        <w:t>(2), 161-168. https://doi.org/10.56525/QSRQ6093</w:t>
       </w:r>
     </w:p>
     <w:p>

</xml_diff>

<commit_message>
Switch essay topic to respect for elderly (from official topic list)
Co-authored-by: Notab123 <aliyaakhmetova12@gmail.com>
</commit_message>
<xml_diff>
--- a/kazakh-b1/Kanapiyauly_Yernur_SE-2509_Assignment1.docx
+++ b/kazakh-b1/Kanapiyauly_Yernur_SE-2509_Assignment1.docx
@@ -10,7 +10,7 @@
         <w:rPr>
           <w:b/>
         </w:rPr>
-        <w:t>Жасанды интеллект және киберқауіпсіздік: қорғаушы ма, әлде қауіп пе?</w:t>
+        <w:t>Қазіргі қоғамдағы қарт адамдарға көрсетілетін құрмет деңгейі қандай?</w:t>
       </w:r>
     </w:p>
     <w:p>
@@ -40,7 +40,7 @@
         <w:rPr>
           <w:b w:val="0"/>
         </w:rPr>
-        <w:t>Мен бұл тақырыпты таңдадым, себебі қазір интернет-алаяқтық өте көп. Алаяқтар жасанды интеллектті (ЖИ) де қолдана бастады. Бұл мәселе әр адамға қатысты.</w:t>
+        <w:t>Мен бұл тақырыпты таңдадым, себебі қазақ халқы үшін үлкенді сыйлау өте маңызды. Бірақ қазір елімізде қарттар үйі бар, кейбір қарттар жалғыз тұрады. Мен қазіргі жағдайды білгім келді.</w:t>
       </w:r>
     </w:p>
     <w:p>
@@ -51,7 +51,7 @@
         <w:rPr>
           <w:b w:val="0"/>
         </w:rPr>
-        <w:t>Материалды негізінен интернеттен іздедім. Google жүйесіне «жасанды интеллект киберқауіпсіздік», «ЖИ алаяқтық» деген сөздерді қазақша жаздым. Ғылыми мақалаларды CyberLeninka сайтынан және университет журналдарының сайттарынан таптым. Жаңалықтарды El.kz және BAQ.KZ сайттарынан алдым. Тағы бір дереккөз - ESET антивирус компаниясының сайты.</w:t>
+        <w:t>Материалды негізінен интернеттен іздедім. Google жүйесіне «қарттарға құрмет», «қарттар үйі», «үлкенді құрметтеу» деген сөздерді қазақша жаздым. Жаңалықтарды Tengrinews.kz, Azattyq Rýhy және Ushqyn.kz сайттарынан алдым. Статистиканы Ұлттық статистика бюросының сайтынан (gov.kz) таптым. Ғылыми мақаланы ғылыми журналдың сайтынан алдым.</w:t>
       </w:r>
     </w:p>
     <w:p>
@@ -62,7 +62,7 @@
         <w:rPr>
           <w:b w:val="0"/>
         </w:rPr>
-        <w:t>Дереккөздерді таңдағанда мына критерийлерге сүйендім: мәтін қазақ тілінде болуы керек; ақпарат жаңа болуы керек (2022-2026 жылдар); авторы немесе ұйымы белгілі болуы керек; сайт сенімді болуы керек.</w:t>
+        <w:t>Дереккөздерді таңдағанда мына критерийлерге сүйендім: мәтін қазақ тілінде болуы керек; ақпарат жаңа болуы керек; авторы немесе ұйымы белгілі болуы керек; тек пікір емес, нақты деректер де болуы керек.</w:t>
       </w:r>
     </w:p>
     <w:p>
@@ -73,7 +73,7 @@
         <w:rPr>
           <w:b w:val="0"/>
         </w:rPr>
-        <w:t>Бірінші қиындық - бұл тақырып бойынша материалдардың көбі орыс немесе ағылшын тілінде. Кейбір мақалалардың тақырыбы қазақша, бірақ толық мәтіні орысша болып шықты. Сондықтан оларды тізімге қоспадым. Екінші қиындық - ғылыми мақалаларда техникалық терминдер көп. Түсінбеген сөздерді сөздіктен қарадым. Әлеуметтік желілердегі жазбаларды алмадым, себебі олардың авторы белгісіз және ақпараты тексерілмеген.</w:t>
+        <w:t>Бірінші қиындық - бұл тақырып бойынша мақалалар өте көп, бірақ олардың көбі бір-біріне ұқсас. Онда тек «қарттарды сыйлау керек» деп жазылған, нақты факт жоқ. Сондықтан мен сандары бар мақалаларды іздедім. Екінші қиындық - сандар әр мақалада әртүрлі болды. Мен мақаланың жылына қарадым. Оқушылардың эсселерін және әлеуметтік желілердегі жазбаларды алмадым, себебі оларда дерек жоқ.</w:t>
       </w:r>
     </w:p>
     <w:p>
@@ -95,16 +95,16 @@
         <w:rPr>
           <w:b w:val="0"/>
         </w:rPr>
-        <w:t>Мен El.kz мақаласын (Асылбекова, 2026), ESET мақаласын (ESET, 2025) және BAQ.KZ жаңалығын (</w:t>
+        <w:t>Мен Ushqyn.kz мақаласын (</w:t>
       </w:r>
       <w:r>
         <w:rPr>
           <w:i/>
         </w:rPr>
-        <w:t>Алаяқтар жасанды интеллект арқылы алдауға көшті</w:t>
+        <w:t>Қарттар - қоғамның қазынасы</w:t>
       </w:r>
       <w:r>
-        <w:t>, 2026) салыстырдым.</w:t>
+        <w:t>, 2025), Azattyq Rýhy мақаласын (Абай, 2025) және Tengrinews.kz мақаласын (Дүйсенғұлова &amp; Алжабаев, 2026) салыстырдым.</w:t>
       </w:r>
     </w:p>
     <w:p>
@@ -115,7 +115,7 @@
         <w:rPr>
           <w:b w:val="0"/>
         </w:rPr>
-        <w:t>Ұқсастығы. Үш дереккөз де алаяқтар ЖИ-ді белсенді қолданып жүргенін айтады. Үшеуі де фишинг пен жалған дауыс, яғни дипфейк туралы жазады. Үшеуі де адамдарға сақ болуға және жеке деректерді ешкімге бермеуге кеңес береді.</w:t>
+        <w:t>Ұқсастығы. Үш дереккөз де қарттар үйі туралы айтады. Үшеуі де қарттардың жалғыздығы - үлкен мәселе деп санайды. Үшеуі де қарттарға тек ақша емес, көңіл бөлу керек екенін көрсетеді.</w:t>
       </w:r>
     </w:p>
     <w:p>
@@ -126,7 +126,7 @@
         <w:rPr>
           <w:b w:val="0"/>
         </w:rPr>
-        <w:t>Айырмашылығы. El.kz мақаласы ЖИ-ді пайдалы құрал ретінде көрсетеді. Автордың ойынша, ең басты қауіп - адамның өзі: әлсіз құпиясөз, бір құпиясөзді бірнеше жерде қолдану. ESET - антивирус компаниясы. Оның мақаласында ЖИ-дің екі жағы да бар: мамандар оны қорғау үшін, ал қылмыскерлер шабуыл үшін қолданады. Бұл мақала көбірек болашақтағы қауіптер туралы. BAQ.KZ мақаласы - жаңалық, ол Ішкі істер министрлігінің ескертуіне негізделген. Мұнда Қазақстандағы нақты жағдай айтылады: алаяқтар полиция немесе банк қызметкері болып бейнеқоңырау шалады.</w:t>
+        <w:t>Айырмашылығы. Ushqyn.kz мақаласы қысқа және эмоционалды. Онда сан жоқ, тек дәстүр мен мақал бар: «Қартың болса - қазынаң». Автор қарттар үйінің көбеюін «дабыл» деп атайды. Azattyq Rýhy мақаласы министрліктің ресми жауабына негізделген. Онда нақты сандар бар: елімізде 45 мемлекеттік қарттар үйі бар, онда 6 694 зейнеткер тұрады, олардың 60 пайызы - ер адамдар. Tengrinews.kz - репортаж. Журналистер «Шарапат» орталығында бір күн болып, қарттармен сөйлескен. Мәдениеттанушы ер адамдардың неге жалғыз қалатынын түсіндіреді: әйелі қайтқан соң, ол туыстарымен байланысты жоғалтады.</w:t>
       </w:r>
     </w:p>
     <w:p>
@@ -137,7 +137,7 @@
         <w:rPr>
           <w:b w:val="0"/>
         </w:rPr>
-        <w:t>Қысқасы, El.kz кеңес береді, ESET қауіпті талдайды, ал BAQ.KZ нақты фактілерді хабарлайды.</w:t>
+        <w:t>Қысқасы, Ushqyn.kz бізді сезімге шақырады, Azattyq Rýhy сандарды береді, ал Tengrinews.kz адамдардың нақты тағдырын көрсетеді.</w:t>
       </w:r>
     </w:p>
     <w:p>
@@ -159,7 +159,7 @@
         <w:rPr>
           <w:b w:val="0"/>
         </w:rPr>
-        <w:t>Жилкишбаева және т.б. (2022) ғылыми мақаласында киберкеңістіктегі күрес «машиналар соғысы» деп аталады. Яғни, бір жақта ЖИ қорғайды, ал екінші жақта ЖИ шабуыл жасайды. Бердиярова және т.б. (2026) мәселенің құқықтық жағын қарастырады. Олар Қазақстанда «Жасанды интеллект туралы» заң бар екенін айтады, бірақ заңды әлі де жетілдіру керек деп санайды.</w:t>
+        <w:t>Сейітов (2020) ғылыми мақаласында үлкенді құрметтеу қазақ халқының басты құндылықтарының бірі екенін айтады. Автордың ойынша, бұл дәстүрге Ислам діні де әсер еткен. Ұлттық статистика бюросының (н.д.) мәліметі бойынша, 2023 жылдың басында елімізде 60 жастан асқан 2 616 515 адам болған. Бұл - халықтың 13,2 пайызы.</w:t>
       </w:r>
     </w:p>
     <w:p>
@@ -170,7 +170,7 @@
         <w:rPr>
           <w:b w:val="0"/>
         </w:rPr>
-        <w:t>Меніңше, ЖИ өзі жақсы да, жаман да емес. Бұл - құрал. Оны кім және қалай қолданатыны маңызды. «Машиналар соғысы» деген ой мұны жақсы көрсетеді.</w:t>
+        <w:t>Меніңше, қазіргі қоғамда қарттарға құрмет әлі де бар. Біз үлкендерге сәлем береміз, автобуста орын береміз, тойда ақсақалдан бата сұраймыз. Бұл дәстүр жоғалған жоқ.</w:t>
       </w:r>
     </w:p>
     <w:p>
@@ -181,7 +181,7 @@
         <w:rPr>
           <w:b w:val="0"/>
         </w:rPr>
-        <w:t>Мен El.kz авторымен келісемін: ең әлсіз буын - адам. Ең жақсы бағдарлама да адамның қатесінен қорғай алмайды. Мысалы, адам SMS-кодты алаяққа өзі айтып қойса, ешбір жүйе көмектеспейді.</w:t>
+        <w:t>Бірақ мен Ushqyn.kz авторымен толық келіспеймін. Сандарды салыстырып көрдім: елімізде 2,6 миллион қарт адам бар, ал мемлекеттік қарттар үйінде шамамен 7 мың адам ғана тұрады. Яғни қарттардың көпшілігі әлі де отбасымен бірге тұрады. Сондықтан «барлық жастар қарттарды сыйламайды» деу дұрыс емес деп ойлаймын.</w:t>
       </w:r>
     </w:p>
     <w:p>
@@ -192,7 +192,7 @@
         <w:rPr>
           <w:b w:val="0"/>
         </w:rPr>
-        <w:t>Бірақ бір нәрсеге толық келіспеймін. Кейбір мақалалар барлық жауапкершілікті қарапайым адамға жүктейді. Меніңше, банктер мен мемлекет те жауапты. Мысалы, банк күдікті аударымды бірден тоқтатуы керек. Сондықтан Бердиярова және т.б. (2026) заңды жетілдіру туралы айтқаны дұрыс деп ойлаймын.</w:t>
+        <w:t>Екінші жағынан, Tengrinews.kz мақаласы маған ұнады. Ол мәселе тек «жаман балаларда» емес екенін көрсетеді. Кейде қарт адам жалғыз қалады, себебі жұбайы қайтыс болды немесе балалары басқа қалада тұрады. Сондықтан кінәлі адам іздеудің орнына, көмек беру керек.</w:t>
       </w:r>
     </w:p>
     <w:p>
@@ -203,7 +203,7 @@
         <w:rPr>
           <w:b w:val="0"/>
         </w:rPr>
-        <w:t>Тағы бір мәселе - егде адамдар. Жастар жаңа технологияны жақсы біледі, ал ата-әжелеріміз жалған дауысты ажырата алмауы мүмкін. Сондықтан отбасында цифрлық сауаттылық туралы сөйлесу керек. Мысалы, отбасында тек өзімізге белгілі «құпия сөз» ойлап табуға болады.</w:t>
+        <w:t>Менің ойымша, қазір құрметтің түрі өзгерді. Бұрын жастар мен қарттар бір үйде тұрды. Қазір көп жастар оқу мен жұмыс үшін қалаға кетеді. Бірақ телефон арқылы күнде хабарласуға болады. Мысалы, мен атам мен әжеме жиі қоңырау шаламын, оларға телефонды қолдануды үйреттім.</w:t>
       </w:r>
     </w:p>
     <w:p>
@@ -214,7 +214,7 @@
         <w:rPr>
           <w:b w:val="0"/>
         </w:rPr>
-        <w:t>Дереккөздердің кемшілігі де бар. Жаңалық мақалаларында статистика аз, ал ғылыми мақалалар қарапайым оқырманға күрделі.</w:t>
+        <w:t>Дереккөздердің кемшілігі де бар. Кейбір мақалаларда тек эмоция бар, нақты дерек жоқ. Ал статистикада адамдардың сезімі көрінбейді. Сондықтан бірнеше дереккөзді бірге оқу керек.</w:t>
       </w:r>
     </w:p>
     <w:p>
@@ -225,7 +225,7 @@
         <w:rPr>
           <w:b w:val="0"/>
         </w:rPr>
-        <w:t>Қорытындылай келе, ЖИ - әрі қорғаушы, әрі қауіп. Меніңше, қорғанудың ең жақсы жолы - сақ болу, сыни ойлау және ақпаратты тексеру.</w:t>
+        <w:t>Қорытындылай келе, қазіргі қоғамда қарттарға құрмет деңгейі жаман емес, бірақ жалғыздық мәселесі бар. Меніңше, құрмет - тек сәлем беру емес, қарт адаммен уақыт өткізу және оны тыңдау.</w:t>
       </w:r>
     </w:p>
     <w:p>
@@ -250,15 +250,21 @@
       </w:pPr>
       <w:r>
         <w:rPr>
+          <w:i w:val="0"/>
+        </w:rPr>
+        <w:t xml:space="preserve">Абай, Н. (2025, 12 маусым). </w:t>
+      </w:r>
+      <w:r>
+        <w:rPr>
           <w:i/>
         </w:rPr>
-        <w:t xml:space="preserve">Алаяқтар жасанды интеллект арқылы алдауға көшті: Қалай сақтану керек? </w:t>
+        <w:t>Қазақстанда қарттар үйін паналайтын ер адамдардың саны көбейіп барады</w:t>
       </w:r>
       <w:r>
         <w:rPr>
           <w:i w:val="0"/>
         </w:rPr>
-        <w:t>(2026, 14 сәуір). BAQ.KZ. https://baq.kz/alayaqtar-zhasandy-intellekt-arqyly-aldauga-koshti-qalay-saqtanu-kerek-320022472/</w:t>
+        <w:t>. Azattyq Rýhy. https://azattyq-ruhy.kz/society/91020-kazakstanda-karttar-uiin-panalaityn-er-adamdardyn-sany-kobeiip-barady</w:t>
       </w:r>
     </w:p>
     <w:p>
@@ -269,19 +275,36 @@
         <w:rPr>
           <w:i w:val="0"/>
         </w:rPr>
-        <w:t xml:space="preserve">Асылбекова, М. (2026, 14 сәуір). </w:t>
+        <w:t xml:space="preserve">Дүйсенғұлова, Р., &amp; Алжабаев, Н. (2026, 23 қыркүйек). </w:t>
       </w:r>
       <w:r>
         <w:rPr>
           <w:i/>
         </w:rPr>
-        <w:t>Киберқауіпсіздік: ЖИ қандай кеңес береді</w:t>
+        <w:t>«Демек, дұрыс тәрбие бермегенмін». Неге қазақстандық ерлер қарттар үйіне жиі түседі?</w:t>
       </w:r>
       <w:r>
         <w:rPr>
           <w:i w:val="0"/>
         </w:rPr>
-        <w:t>. El.kz. https://el.kz/kiberqauipsizdik-zhi-qanday-kenes-beredi_400046187/</w:t>
+        <w:t xml:space="preserve"> Tengrinews.kz. https://kaz.tengrinews.kz/article/demek-duryis-tarbie-bermegenmn-nege-kazakstandyik-erler-2170/</w:t>
+      </w:r>
+    </w:p>
+    <w:p>
+      <w:pPr>
+        <w:ind w:left="720" w:hanging="720"/>
+      </w:pPr>
+      <w:r>
+        <w:rPr>
+          <w:i/>
+        </w:rPr>
+        <w:t xml:space="preserve">Қарттар - қоғамның қазынасы. </w:t>
+      </w:r>
+      <w:r>
+        <w:rPr>
+          <w:i w:val="0"/>
+        </w:rPr>
+        <w:t>(2025, 13 шілде). Ushqyn.kz. https://ushqyn.kz/ruhaniyat/karttar-kogamnyn-kazynasy/</w:t>
       </w:r>
     </w:p>
     <w:p>
@@ -292,19 +315,19 @@
         <w:rPr>
           <w:i w:val="0"/>
         </w:rPr>
-        <w:t xml:space="preserve">Бердиярова, Ж. С., Саймова, Ш. А., &amp; Абдуллаева, Д. С. (2026). Жасанды интеллектіні пайдаланудың құқықтық мәселелері. </w:t>
+        <w:t xml:space="preserve">Сейітов, М. (2020). Қазақ халқының салт-дәстүрінде үлкенді құрметтеу этикасына Ислам дінінің ықпалы. </w:t>
       </w:r>
       <w:r>
         <w:rPr>
           <w:i/>
         </w:rPr>
-        <w:t>Л.Н. Гумилев атындағы Еуразия ұлттық университетінің Хабаршысы. Құқық сериясы, 154</w:t>
+        <w:t>Challenges of Science, 3</w:t>
       </w:r>
       <w:r>
         <w:rPr>
           <w:i w:val="0"/>
         </w:rPr>
-        <w:t>(1), 41-50. https://doi.org/10.32523/2616-6844-2026-154-1-41-50</w:t>
+        <w:t>, 105-114. https://doi.org/10.31643/2020.015</w:t>
       </w:r>
     </w:p>
     <w:p>
@@ -315,42 +338,19 @@
         <w:rPr>
           <w:i w:val="0"/>
         </w:rPr>
-        <w:t xml:space="preserve">Жилкишбаева, Г. С., Утебай, О. Қ., &amp; Варченко, Е. И. (2022). Ақпараттық қауіпсіздікте жасанды интеллектті қолдану. </w:t>
+        <w:t xml:space="preserve">Ұлттық статистика бюросы. (н.д.). </w:t>
       </w:r>
       <w:r>
         <w:rPr>
           <w:i/>
         </w:rPr>
-        <w:t>Yessenov Science Journal, 43</w:t>
+        <w:t>Қазақстан Республикасындағы қарттардың әлеуметтік жағдайы</w:t>
       </w:r>
       <w:r>
         <w:rPr>
           <w:i w:val="0"/>
         </w:rPr>
-        <w:t>(2), 161-168. https://doi.org/10.56525/QSRQ6093</w:t>
-      </w:r>
-    </w:p>
-    <w:p>
-      <w:pPr>
-        <w:ind w:left="720" w:hanging="720"/>
-      </w:pPr>
-      <w:r>
-        <w:rPr>
-          <w:i w:val="0"/>
-        </w:rPr>
-        <w:t xml:space="preserve">ESET. (2025, 31 қаңтар). </w:t>
-      </w:r>
-      <w:r>
-        <w:rPr>
-          <w:i/>
-        </w:rPr>
-        <w:t>Жасанды интеллекттің 2025 жылы артықшылықтары мен қауіптері</w:t>
-      </w:r>
-      <w:r>
-        <w:rPr>
-          <w:i w:val="0"/>
-        </w:rPr>
-        <w:t>. https://www.eset.com/kz/about/newsroom/press-releases/malware/tekhnologiyalardyn-bolashagy-nemese-kauip-zhasandy-intellektten-2025-zhyly-neni-kutuge-bolady/</w:t>
+        <w:t>. https://www.gov.kz/memleket/entities/stat/press/news/details/628195</w:t>
       </w:r>
     </w:p>
     <w:sectPr>

</xml_diff>